<commit_message>
Searching and validation on list
</commit_message>
<xml_diff>
--- a/lab-b/AI1-LB-gr3-Droma-Wojciech.docx
+++ b/lab-b/AI1-LB-gr3-Droma-Wojciech.docx
@@ -1805,14 +1805,12 @@
         </w:rPr>
         <w:t xml:space="preserve"> i zaktualizuj pola. Następnie uruchom ten dokument ponownie lub </w:t>
       </w:r>
-      <w:proofErr w:type="spellStart"/>
       <w:r>
         <w:rPr>
           <w:rStyle w:val="inline-code"/>
         </w:rPr>
         <w:t>Ctrl+A</w:t>
       </w:r>
-      <w:proofErr w:type="spellEnd"/>
       <w:r>
         <w:rPr>
           <w:lang w:val="pl-PL"/>
@@ -2086,21 +2084,7 @@
         <w:rPr>
           <w:lang w:val="pl-PL"/>
         </w:rPr>
-        <w:t xml:space="preserve">wpisy na liście zapisują się do </w:t>
-      </w:r>
-      <w:proofErr w:type="spellStart"/>
-      <w:r>
-        <w:rPr>
-          <w:lang w:val="pl-PL"/>
-        </w:rPr>
-        <w:t>Local</w:t>
-      </w:r>
-      <w:proofErr w:type="spellEnd"/>
-      <w:r>
-        <w:rPr>
-          <w:lang w:val="pl-PL"/>
-        </w:rPr>
-        <w:t xml:space="preserve"> Storage</w:t>
+        <w:t>wpisy na liście zapisują się do Local Storage</w:t>
       </w:r>
     </w:p>
     <w:p>
@@ -2118,42 +2102,20 @@
         <w:rPr>
           <w:lang w:val="pl-PL"/>
         </w:rPr>
-        <w:t xml:space="preserve">po odświeżeniu strony lista wypełnia się wpisami z </w:t>
-      </w:r>
-      <w:proofErr w:type="spellStart"/>
-      <w:r>
-        <w:rPr>
-          <w:lang w:val="pl-PL"/>
-        </w:rPr>
-        <w:t>Local</w:t>
-      </w:r>
-      <w:proofErr w:type="spellEnd"/>
-      <w:r>
-        <w:rPr>
-          <w:lang w:val="pl-PL"/>
-        </w:rPr>
-        <w:t xml:space="preserve"> Storage</w:t>
-      </w:r>
-    </w:p>
-    <w:p>
-      <w:pPr>
-        <w:rPr>
-          <w:lang w:val="pl-PL"/>
-        </w:rPr>
-      </w:pPr>
-      <w:proofErr w:type="spellStart"/>
-      <w:r>
-        <w:rPr>
-          <w:lang w:val="pl-PL"/>
-        </w:rPr>
-        <w:t>Mockupy</w:t>
-      </w:r>
-      <w:proofErr w:type="spellEnd"/>
-      <w:r>
-        <w:rPr>
-          <w:lang w:val="pl-PL"/>
-        </w:rPr>
-        <w:t>:</w:t>
+        <w:t>po odświeżeniu strony lista wypełnia się wpisami z Local Storage</w:t>
+      </w:r>
+    </w:p>
+    <w:p>
+      <w:pPr>
+        <w:rPr>
+          <w:lang w:val="pl-PL"/>
+        </w:rPr>
+      </w:pPr>
+      <w:r>
+        <w:rPr>
+          <w:lang w:val="pl-PL"/>
+        </w:rPr>
+        <w:t>Mockupy:</w:t>
       </w:r>
     </w:p>
     <w:p>
@@ -2526,43 +2488,21 @@
         <w:rPr>
           <w:lang w:val="pl-PL"/>
         </w:rPr>
-        <w:t xml:space="preserve">Klasa </w:t>
-      </w:r>
-      <w:proofErr w:type="spellStart"/>
-      <w:r>
-        <w:rPr>
-          <w:lang w:val="pl-PL"/>
-        </w:rPr>
-        <w:t>Todo</w:t>
+        <w:t>Klasa Todo</w:t>
       </w:r>
       <w:bookmarkEnd w:id="9"/>
-      <w:proofErr w:type="spellEnd"/>
-    </w:p>
-    <w:p>
-      <w:pPr>
-        <w:rPr>
-          <w:lang w:val="pl-PL"/>
-        </w:rPr>
-      </w:pPr>
-      <w:r>
-        <w:rPr>
-          <w:lang w:val="pl-PL"/>
-        </w:rPr>
-        <w:t xml:space="preserve">Pierwszym instynktem może być chęć dodania </w:t>
-      </w:r>
-      <w:proofErr w:type="spellStart"/>
-      <w:r>
-        <w:rPr>
-          <w:lang w:val="pl-PL"/>
-        </w:rPr>
-        <w:t>zachowań</w:t>
-      </w:r>
-      <w:proofErr w:type="spellEnd"/>
-      <w:r>
-        <w:rPr>
-          <w:lang w:val="pl-PL"/>
-        </w:rPr>
-        <w:t xml:space="preserve"> bezpośrednio do elementów listy</w:t>
+    </w:p>
+    <w:p>
+      <w:pPr>
+        <w:rPr>
+          <w:lang w:val="pl-PL"/>
+        </w:rPr>
+      </w:pPr>
+      <w:r>
+        <w:rPr>
+          <w:lang w:val="pl-PL"/>
+        </w:rPr>
+        <w:t>Pierwszym instynktem może być chęć dodania zachowań bezpośrednio do elementów listy</w:t>
       </w:r>
       <w:r>
         <w:rPr>
@@ -2606,183 +2546,123 @@
         <w:rPr>
           <w:lang w:val="pl-PL"/>
         </w:rPr>
-        <w:t xml:space="preserve">Najlepszym sposobem rozwiązania tego laboratorium jest utworzenie klasy </w:t>
-      </w:r>
-      <w:proofErr w:type="spellStart"/>
-      <w:r>
-        <w:rPr>
-          <w:lang w:val="pl-PL"/>
-        </w:rPr>
-        <w:t>Todo</w:t>
-      </w:r>
-      <w:proofErr w:type="spellEnd"/>
-      <w:r>
-        <w:rPr>
-          <w:lang w:val="pl-PL"/>
-        </w:rPr>
-        <w:t xml:space="preserve"> (albo po prostu obiektu z kilkoma metodami). Bez względu na przyjętą strategię, należy w tym nowoutworzonym bycie utworzyć tablicę </w:t>
-      </w:r>
-      <w:proofErr w:type="spellStart"/>
+        <w:t xml:space="preserve">Najlepszym sposobem rozwiązania tego laboratorium jest utworzenie klasy Todo (albo po prostu obiektu z kilkoma metodami). Bez względu na przyjętą strategię, należy w tym nowoutworzonym bycie utworzyć tablicę </w:t>
+      </w:r>
       <w:r>
         <w:rPr>
           <w:rStyle w:val="inline-code"/>
         </w:rPr>
         <w:t>tasks</w:t>
       </w:r>
-      <w:proofErr w:type="spellEnd"/>
       <w:r>
         <w:rPr>
           <w:lang w:val="pl-PL"/>
         </w:rPr>
         <w:t xml:space="preserve"> oraz metodę </w:t>
       </w:r>
-      <w:proofErr w:type="spellStart"/>
       <w:r>
         <w:rPr>
           <w:rStyle w:val="inline-code"/>
         </w:rPr>
-        <w:t>draw</w:t>
-      </w:r>
-      <w:proofErr w:type="spellEnd"/>
+        <w:t>draw()</w:t>
+      </w:r>
+      <w:r>
+        <w:rPr>
+          <w:lang w:val="pl-PL"/>
+        </w:rPr>
+        <w:t xml:space="preserve">, która wyczyści </w:t>
+      </w:r>
       <w:r>
         <w:rPr>
           <w:rStyle w:val="inline-code"/>
         </w:rPr>
-        <w:t>()</w:t>
-      </w:r>
-      <w:r>
-        <w:rPr>
-          <w:lang w:val="pl-PL"/>
-        </w:rPr>
-        <w:t xml:space="preserve">, która wyczyści </w:t>
+        <w:t>div</w:t>
+      </w:r>
+      <w:r>
+        <w:rPr>
+          <w:lang w:val="pl-PL"/>
+        </w:rPr>
+        <w:t xml:space="preserve"> z obecną wizualizacją zadań do zrobienia i wygeneruje ją na nowo na podstawie tablicy </w:t>
       </w:r>
       <w:r>
         <w:rPr>
           <w:rStyle w:val="inline-code"/>
         </w:rPr>
-        <w:t>div</w:t>
-      </w:r>
-      <w:r>
-        <w:rPr>
-          <w:lang w:val="pl-PL"/>
-        </w:rPr>
-        <w:t xml:space="preserve"> z obecną wizualizacją zadań do zrobienia i wygeneruje ją na nowo na podstawie tablicy </w:t>
-      </w:r>
-      <w:proofErr w:type="spellStart"/>
+        <w:t>tasks</w:t>
+      </w:r>
+      <w:r>
+        <w:rPr>
+          <w:lang w:val="pl-PL"/>
+        </w:rPr>
+        <w:t>.</w:t>
+      </w:r>
+    </w:p>
+    <w:p>
+      <w:pPr>
+        <w:rPr>
+          <w:lang w:val="pl-PL"/>
+        </w:rPr>
+      </w:pPr>
+      <w:r>
+        <w:rPr>
+          <w:lang w:val="pl-PL"/>
+        </w:rPr>
+        <w:t xml:space="preserve">W celu sprawdzenia poprawności działania, najlepiej dostać się do tablicy </w:t>
+      </w:r>
       <w:r>
         <w:rPr>
           <w:rStyle w:val="inline-code"/>
         </w:rPr>
         <w:t>tasks</w:t>
       </w:r>
-      <w:proofErr w:type="spellEnd"/>
-      <w:r>
-        <w:rPr>
-          <w:lang w:val="pl-PL"/>
-        </w:rPr>
-        <w:t>.</w:t>
-      </w:r>
-    </w:p>
-    <w:p>
-      <w:pPr>
-        <w:rPr>
-          <w:lang w:val="pl-PL"/>
-        </w:rPr>
-      </w:pPr>
-      <w:r>
-        <w:rPr>
-          <w:lang w:val="pl-PL"/>
-        </w:rPr>
-        <w:t xml:space="preserve">W celu sprawdzenia poprawności działania, najlepiej dostać się do tablicy </w:t>
-      </w:r>
-      <w:proofErr w:type="spellStart"/>
+      <w:r>
+        <w:rPr>
+          <w:lang w:val="pl-PL"/>
+        </w:rPr>
+        <w:t xml:space="preserve"> i edytować jej zawartość, po czym ręcznie wywołać metodę </w:t>
+      </w:r>
       <w:r>
         <w:rPr>
           <w:rStyle w:val="inline-code"/>
         </w:rPr>
+        <w:t>draw()</w:t>
+      </w:r>
+      <w:r>
+        <w:rPr>
+          <w:lang w:val="pl-PL"/>
+        </w:rPr>
+        <w:t>. Jeśli zawartość listy wyrenderuje się na nowo poprawnie – możemy iść dalej!</w:t>
+      </w:r>
+    </w:p>
+    <w:p>
+      <w:pPr>
+        <w:rPr>
+          <w:lang w:val="pl-PL"/>
+        </w:rPr>
+      </w:pPr>
+      <w:r>
+        <w:rPr>
+          <w:lang w:val="pl-PL"/>
+        </w:rPr>
+        <w:t xml:space="preserve">Zaimplementuj dodawanie, usuwanie, edycję pozycji listy – wszystko modyfikujące tablicę </w:t>
+      </w:r>
+      <w:r>
+        <w:rPr>
+          <w:rStyle w:val="inline-code"/>
+        </w:rPr>
         <w:t>tasks</w:t>
       </w:r>
-      <w:proofErr w:type="spellEnd"/>
-      <w:r>
-        <w:rPr>
-          <w:lang w:val="pl-PL"/>
-        </w:rPr>
-        <w:t xml:space="preserve"> i edytować jej zawartość, po czym ręcznie wywołać metodę </w:t>
-      </w:r>
-      <w:proofErr w:type="spellStart"/>
+      <w:r>
+        <w:rPr>
+          <w:lang w:val="pl-PL"/>
+        </w:rPr>
+        <w:t xml:space="preserve"> i wywołujące na koniec metodę </w:t>
+      </w:r>
       <w:r>
         <w:rPr>
           <w:rStyle w:val="inline-code"/>
         </w:rPr>
-        <w:t>draw</w:t>
-      </w:r>
-      <w:proofErr w:type="spellEnd"/>
-      <w:r>
-        <w:rPr>
-          <w:rStyle w:val="inline-code"/>
-        </w:rPr>
-        <w:t>()</w:t>
-      </w:r>
-      <w:r>
-        <w:rPr>
-          <w:lang w:val="pl-PL"/>
-        </w:rPr>
-        <w:t xml:space="preserve">. Jeśli zawartość listy </w:t>
-      </w:r>
-      <w:proofErr w:type="spellStart"/>
-      <w:r>
-        <w:rPr>
-          <w:lang w:val="pl-PL"/>
-        </w:rPr>
-        <w:t>wyrenderuje</w:t>
-      </w:r>
-      <w:proofErr w:type="spellEnd"/>
-      <w:r>
-        <w:rPr>
-          <w:lang w:val="pl-PL"/>
-        </w:rPr>
-        <w:t xml:space="preserve"> się na nowo poprawnie – możemy iść dalej!</w:t>
-      </w:r>
-    </w:p>
-    <w:p>
-      <w:pPr>
-        <w:rPr>
-          <w:lang w:val="pl-PL"/>
-        </w:rPr>
-      </w:pPr>
-      <w:r>
-        <w:rPr>
-          <w:lang w:val="pl-PL"/>
-        </w:rPr>
-        <w:t xml:space="preserve">Zaimplementuj dodawanie, usuwanie, edycję pozycji listy – wszystko modyfikujące tablicę </w:t>
-      </w:r>
-      <w:proofErr w:type="spellStart"/>
-      <w:r>
-        <w:rPr>
-          <w:rStyle w:val="inline-code"/>
-        </w:rPr>
-        <w:t>tasks</w:t>
-      </w:r>
-      <w:proofErr w:type="spellEnd"/>
-      <w:r>
-        <w:rPr>
-          <w:lang w:val="pl-PL"/>
-        </w:rPr>
-        <w:t xml:space="preserve"> i wywołujące na koniec metodę </w:t>
-      </w:r>
-      <w:proofErr w:type="spellStart"/>
-      <w:r>
-        <w:rPr>
-          <w:rStyle w:val="inline-code"/>
-        </w:rPr>
-        <w:t>draw</w:t>
-      </w:r>
-      <w:proofErr w:type="spellEnd"/>
-      <w:r>
-        <w:rPr>
-          <w:rStyle w:val="inline-code"/>
-        </w:rPr>
-        <w:t>()</w:t>
+        <w:t>draw()</w:t>
       </w:r>
       <w:r>
         <w:rPr>
@@ -3569,99 +3449,21 @@
         <w:rPr>
           <w:lang w:val="pl-PL"/>
         </w:rPr>
-        <w:t xml:space="preserve">Odczyt / Zapis </w:t>
-      </w:r>
-      <w:proofErr w:type="spellStart"/>
-      <w:r>
-        <w:rPr>
-          <w:lang w:val="pl-PL"/>
-        </w:rPr>
-        <w:t>LocalStorage</w:t>
+        <w:t>Odczyt / Zapis LocalStorage</w:t>
       </w:r>
       <w:bookmarkEnd w:id="13"/>
-      <w:proofErr w:type="spellEnd"/>
-    </w:p>
-    <w:p>
-      <w:pPr>
-        <w:rPr>
-          <w:lang w:val="pl-PL"/>
-        </w:rPr>
-      </w:pPr>
-      <w:r>
-        <w:rPr>
-          <w:lang w:val="pl-PL"/>
-        </w:rPr>
-        <w:t xml:space="preserve">Zastosowanie klasy </w:t>
-      </w:r>
-      <w:proofErr w:type="spellStart"/>
-      <w:r>
-        <w:rPr>
-          <w:lang w:val="pl-PL"/>
-        </w:rPr>
-        <w:t>Todo</w:t>
-      </w:r>
-      <w:proofErr w:type="spellEnd"/>
-      <w:r>
-        <w:rPr>
-          <w:lang w:val="pl-PL"/>
-        </w:rPr>
-        <w:t xml:space="preserve"> w realizacji tego laboratorium pozwala w bardzo łatwy sposób odczytywać i zapisywać stan listy do pamięci przeglądarki. Wystarczy </w:t>
-      </w:r>
-      <w:proofErr w:type="spellStart"/>
-      <w:r>
-        <w:rPr>
-          <w:lang w:val="pl-PL"/>
-        </w:rPr>
-        <w:t>serializacja</w:t>
-      </w:r>
-      <w:proofErr w:type="spellEnd"/>
-      <w:r>
-        <w:rPr>
-          <w:lang w:val="pl-PL"/>
-        </w:rPr>
-        <w:t xml:space="preserve"> / </w:t>
-      </w:r>
-      <w:proofErr w:type="spellStart"/>
-      <w:r>
-        <w:rPr>
-          <w:lang w:val="pl-PL"/>
-        </w:rPr>
-        <w:t>deserializacja</w:t>
-      </w:r>
-      <w:proofErr w:type="spellEnd"/>
-      <w:r>
-        <w:rPr>
-          <w:lang w:val="pl-PL"/>
-        </w:rPr>
-        <w:t xml:space="preserve"> za pomocą </w:t>
-      </w:r>
-      <w:proofErr w:type="spellStart"/>
-      <w:r>
-        <w:rPr>
-          <w:lang w:val="pl-PL"/>
-        </w:rPr>
-        <w:t>JSON.parse</w:t>
-      </w:r>
-      <w:proofErr w:type="spellEnd"/>
-      <w:r>
-        <w:rPr>
-          <w:lang w:val="pl-PL"/>
-        </w:rPr>
-        <w:t xml:space="preserve">() i </w:t>
-      </w:r>
-      <w:proofErr w:type="spellStart"/>
-      <w:r>
-        <w:rPr>
-          <w:lang w:val="pl-PL"/>
-        </w:rPr>
-        <w:t>JSON.stringify</w:t>
-      </w:r>
-      <w:proofErr w:type="spellEnd"/>
-      <w:r>
-        <w:rPr>
-          <w:lang w:val="pl-PL"/>
-        </w:rPr>
-        <w:t>().</w:t>
+    </w:p>
+    <w:p>
+      <w:pPr>
+        <w:rPr>
+          <w:lang w:val="pl-PL"/>
+        </w:rPr>
+      </w:pPr>
+      <w:r>
+        <w:rPr>
+          <w:lang w:val="pl-PL"/>
+        </w:rPr>
+        <w:t>Zastosowanie klasy Todo w realizacji tego laboratorium pozwala w bardzo łatwy sposób odczytywać i zapisywać stan listy do pamięci przeglądarki. Wystarczy serializacja / deserializacja za pomocą JSON.parse() i JSON.stringify().</w:t>
       </w:r>
     </w:p>
     <w:p>
@@ -3669,23 +3471,7 @@
         <w:pStyle w:val="Zadanie"/>
       </w:pPr>
       <w:r>
-        <w:t xml:space="preserve">Wstaw zrzuty ekranu przedstawiające wygląd listy i zawartość </w:t>
-      </w:r>
-      <w:proofErr w:type="spellStart"/>
-      <w:r>
-        <w:t>local</w:t>
-      </w:r>
-      <w:proofErr w:type="spellEnd"/>
-      <w:r>
-        <w:t xml:space="preserve"> </w:t>
-      </w:r>
-      <w:proofErr w:type="spellStart"/>
-      <w:r>
-        <w:t>storage</w:t>
-      </w:r>
-      <w:proofErr w:type="spellEnd"/>
-      <w:r>
-        <w:t xml:space="preserve"> gdy na liście są pewne zadania:</w:t>
+        <w:t>Wstaw zrzuty ekranu przedstawiające wygląd listy i zawartość local storage gdy na liście są pewne zadania:</w:t>
       </w:r>
     </w:p>
     <w:p>
@@ -3817,39 +3603,7 @@
         <w:pStyle w:val="Zadanie"/>
       </w:pPr>
       <w:r>
-        <w:t xml:space="preserve">Wstaw zrzuty ekranu przedstawiające wygląd listy i zawartość </w:t>
-      </w:r>
-      <w:proofErr w:type="spellStart"/>
-      <w:r>
-        <w:t>local</w:t>
-      </w:r>
-      <w:proofErr w:type="spellEnd"/>
-      <w:r>
-        <w:t xml:space="preserve"> </w:t>
-      </w:r>
-      <w:proofErr w:type="spellStart"/>
-      <w:r>
-        <w:t>storage</w:t>
-      </w:r>
-      <w:proofErr w:type="spellEnd"/>
-      <w:r>
-        <w:t xml:space="preserve"> po dodaniu nowej pozycji listy. Upewnij się, że widoczne w </w:t>
-      </w:r>
-      <w:proofErr w:type="spellStart"/>
-      <w:r>
-        <w:t>local</w:t>
-      </w:r>
-      <w:proofErr w:type="spellEnd"/>
-      <w:r>
-        <w:t xml:space="preserve"> </w:t>
-      </w:r>
-      <w:proofErr w:type="spellStart"/>
-      <w:r>
-        <w:t>storage</w:t>
-      </w:r>
-      <w:proofErr w:type="spellEnd"/>
-      <w:r>
-        <w:t xml:space="preserve"> są dane dotyczące nowego zadania:</w:t>
+        <w:t>Wstaw zrzuty ekranu przedstawiające wygląd listy i zawartość local storage po dodaniu nowej pozycji listy. Upewnij się, że widoczne w local storage są dane dotyczące nowego zadania:</w:t>
       </w:r>
     </w:p>
     <w:p>
@@ -4071,21 +3825,7 @@
         <w:rPr>
           <w:lang w:val="pl-PL"/>
         </w:rPr>
-        <w:t xml:space="preserve">Na koniec zostało filtrowanie wyników. Proponowanym podejściem do tego tematu jest umieszczenie w klasie </w:t>
-      </w:r>
-      <w:proofErr w:type="spellStart"/>
-      <w:r>
-        <w:rPr>
-          <w:lang w:val="pl-PL"/>
-        </w:rPr>
-        <w:t>Todo</w:t>
-      </w:r>
-      <w:proofErr w:type="spellEnd"/>
-      <w:r>
-        <w:rPr>
-          <w:lang w:val="pl-PL"/>
-        </w:rPr>
-        <w:t xml:space="preserve"> właściwości </w:t>
+        <w:t xml:space="preserve">Na koniec zostało filtrowanie wyników. Proponowanym podejściem do tego tematu jest umieszczenie w klasie Todo właściwości </w:t>
       </w:r>
       <w:r>
         <w:rPr>
@@ -4099,28 +3839,24 @@
         </w:rPr>
         <w:t xml:space="preserve"> – frazy wyszukiwanej przez użytkownika. Następnie można utworzyć metodę </w:t>
       </w:r>
-      <w:proofErr w:type="spellStart"/>
       <w:r>
         <w:rPr>
           <w:rStyle w:val="inline-code"/>
         </w:rPr>
         <w:t>getFilteredTasks</w:t>
       </w:r>
-      <w:proofErr w:type="spellEnd"/>
       <w:r>
         <w:rPr>
           <w:lang w:val="pl-PL"/>
         </w:rPr>
         <w:t xml:space="preserve">, albo getter </w:t>
       </w:r>
-      <w:proofErr w:type="spellStart"/>
       <w:r>
         <w:rPr>
           <w:rStyle w:val="inline-code"/>
         </w:rPr>
         <w:t>filteredTasks</w:t>
       </w:r>
-      <w:proofErr w:type="spellEnd"/>
       <w:r>
         <w:rPr>
           <w:lang w:val="pl-PL"/>
@@ -4133,33 +3869,23 @@
         </w:rPr>
         <w:t xml:space="preserve"> te elementy tablicy </w:t>
       </w:r>
-      <w:proofErr w:type="spellStart"/>
       <w:r>
         <w:rPr>
           <w:rStyle w:val="inline-code"/>
         </w:rPr>
         <w:t>tasks</w:t>
       </w:r>
-      <w:proofErr w:type="spellEnd"/>
       <w:r>
         <w:rPr>
           <w:lang w:val="pl-PL"/>
         </w:rPr>
         <w:t xml:space="preserve">, które odpowiadają zapytaniu. Można użyć funkcji wyższego rzędu </w:t>
       </w:r>
-      <w:proofErr w:type="spellStart"/>
       <w:r>
         <w:rPr>
           <w:rStyle w:val="inline-code"/>
         </w:rPr>
-        <w:t>filter</w:t>
-      </w:r>
-      <w:proofErr w:type="spellEnd"/>
-      <w:r>
-        <w:rPr>
-          <w:rStyle w:val="inline-code"/>
-        </w:rPr>
-        <w:t>()</w:t>
+        <w:t>filter()</w:t>
       </w:r>
       <w:r>
         <w:rPr>
@@ -4562,15 +4288,7 @@
       <w:bookmarkStart w:id="15" w:name="_Toc146283472"/>
       <w:bookmarkStart w:id="16" w:name="_Toc180046702"/>
       <w:r>
-        <w:t xml:space="preserve">Commit </w:t>
-      </w:r>
-      <w:proofErr w:type="spellStart"/>
-      <w:r>
-        <w:t>projektu</w:t>
-      </w:r>
-      <w:proofErr w:type="spellEnd"/>
-      <w:r>
-        <w:t xml:space="preserve"> do GIT</w:t>
+        <w:t>Commit projektu do GIT</w:t>
       </w:r>
       <w:bookmarkEnd w:id="15"/>
       <w:bookmarkEnd w:id="16"/>
@@ -4581,33 +4299,11 @@
           <w:lang w:val="pl-PL"/>
         </w:rPr>
       </w:pPr>
-      <w:proofErr w:type="spellStart"/>
-      <w:r>
-        <w:rPr>
-          <w:lang w:val="pl-PL"/>
-        </w:rPr>
-        <w:t>Zacommituj</w:t>
-      </w:r>
-      <w:proofErr w:type="spellEnd"/>
-      <w:r>
-        <w:rPr>
-          <w:lang w:val="pl-PL"/>
-        </w:rPr>
-        <w:t xml:space="preserve"> i </w:t>
-      </w:r>
-      <w:proofErr w:type="spellStart"/>
-      <w:r>
-        <w:rPr>
-          <w:lang w:val="pl-PL"/>
-        </w:rPr>
-        <w:t>pushnij</w:t>
-      </w:r>
-      <w:proofErr w:type="spellEnd"/>
-      <w:r>
-        <w:rPr>
-          <w:lang w:val="pl-PL"/>
-        </w:rPr>
-        <w:t xml:space="preserve"> </w:t>
+      <w:r>
+        <w:rPr>
+          <w:lang w:val="pl-PL"/>
+        </w:rPr>
+        <w:t xml:space="preserve">Zacommituj i pushnij </w:t>
       </w:r>
       <w:r>
         <w:rPr>
@@ -4638,21 +4334,7 @@
         <w:rPr>
           <w:lang w:val="pl-PL"/>
         </w:rPr>
-        <w:t xml:space="preserve">obrze się wysłało. Jeśli tak, to z poziomu przeglądarki utwórz </w:t>
-      </w:r>
-      <w:proofErr w:type="spellStart"/>
-      <w:r>
-        <w:rPr>
-          <w:lang w:val="pl-PL"/>
-        </w:rPr>
-        <w:t>branch</w:t>
-      </w:r>
-      <w:proofErr w:type="spellEnd"/>
-      <w:r>
-        <w:rPr>
-          <w:lang w:val="pl-PL"/>
-        </w:rPr>
-        <w:t xml:space="preserve"> o nazwie </w:t>
+        <w:t xml:space="preserve">obrze się wysłało. Jeśli tak, to z poziomu przeglądarki utwórz branch o nazwie </w:t>
       </w:r>
       <w:r>
         <w:rPr>
@@ -4679,15 +4361,7 @@
       </w:pPr>
       <w:r>
         <w:lastRenderedPageBreak/>
-        <w:t xml:space="preserve">Podaj link do </w:t>
-      </w:r>
-      <w:proofErr w:type="spellStart"/>
-      <w:r>
-        <w:t>brancha</w:t>
-      </w:r>
-      <w:proofErr w:type="spellEnd"/>
-      <w:r>
-        <w:t xml:space="preserve"> </w:t>
+        <w:t xml:space="preserve">Podaj link do brancha </w:t>
       </w:r>
       <w:r>
         <w:rPr>
@@ -4709,6 +4383,9 @@
       <w:pPr>
         <w:pStyle w:val="Zadanie"/>
       </w:pPr>
+      <w:r>
+        <w:t>https://github.com/Wojtuch566/Aplikacje-Internetowe-1/tree/lab-b</w:t>
+      </w:r>
     </w:p>
     <w:p>
       <w:pPr>
@@ -7418,6 +7095,15 @@
 </file>
 
 <file path=customXml/item1.xml><?xml version="1.0" encoding="utf-8"?>
+<?mso-contentType ?>
+<FormTemplates xmlns="http://schemas.microsoft.com/sharepoint/v3/contenttype/forms">
+  <Display>DocumentLibraryForm</Display>
+  <Edit>DocumentLibraryForm</Edit>
+  <New>DocumentLibraryForm</New>
+</FormTemplates>
+</file>
+
+<file path=customXml/item2.xml><?xml version="1.0" encoding="utf-8"?>
 <ct:contentTypeSchema xmlns:ct="http://schemas.microsoft.com/office/2006/metadata/contentType" xmlns:ma="http://schemas.microsoft.com/office/2006/metadata/properties/metaAttributes" ct:_="" ma:_="" ma:contentTypeName="Dokument" ma:contentTypeID="0x0101001BC44405AC7C2C44B8020FC3397C08FA" ma:contentTypeVersion="5" ma:contentTypeDescription="Utwórz nowy dokument." ma:contentTypeScope="" ma:versionID="97cc567c797193b3bdbfde5bbb7e5f24">
   <xsd:schema xmlns:xsd="http://www.w3.org/2001/XMLSchema" xmlns:xs="http://www.w3.org/2001/XMLSchema" xmlns:p="http://schemas.microsoft.com/office/2006/metadata/properties" xmlns:ns2="39eae624-dce2-4ca1-9525-a899f2494d11" targetNamespace="http://schemas.microsoft.com/office/2006/metadata/properties" ma:root="true" ma:fieldsID="441f60f4a0ff9a3b9f81f00754db7456" ns2:_="">
     <xsd:import namespace="39eae624-dce2-4ca1-9525-a899f2494d11"/>
@@ -7567,20 +7253,7 @@
 </ct:contentTypeSchema>
 </file>
 
-<file path=customXml/item2.xml><?xml version="1.0" encoding="utf-8"?>
-<?mso-contentType ?>
-<FormTemplates xmlns="http://schemas.microsoft.com/sharepoint/v3/contenttype/forms">
-  <Display>DocumentLibraryForm</Display>
-  <Edit>DocumentLibraryForm</Edit>
-  <New>DocumentLibraryForm</New>
-</FormTemplates>
-</file>
-
 <file path=customXml/item3.xml><?xml version="1.0" encoding="utf-8"?>
-<b:Sources xmlns:b="http://schemas.openxmlformats.org/officeDocument/2006/bibliography" xmlns="http://schemas.openxmlformats.org/officeDocument/2006/bibliography" SelectedStyle="\APASixthEditionOfficeOnline.xsl" StyleName="APA" Version="6"/>
-</file>
-
-<file path=customXml/item4.xml><?xml version="1.0" encoding="utf-8"?>
 <p:properties xmlns:p="http://schemas.microsoft.com/office/2006/metadata/properties" xmlns:xsi="http://www.w3.org/2001/XMLSchema-instance" xmlns:pc="http://schemas.microsoft.com/office/infopath/2007/PartnerControls">
   <documentManagement>
     <ReferenceId xmlns="39eae624-dce2-4ca1-9525-a899f2494d11" xsi:nil="true"/>
@@ -7588,7 +7261,19 @@
 </p:properties>
 </file>
 
+<file path=customXml/item4.xml><?xml version="1.0" encoding="utf-8"?>
+<b:Sources xmlns:b="http://schemas.openxmlformats.org/officeDocument/2006/bibliography" xmlns="http://schemas.openxmlformats.org/officeDocument/2006/bibliography" SelectedStyle="\APASixthEditionOfficeOnline.xsl" StyleName="APA" Version="6"/>
+</file>
+
 <file path=customXml/itemProps1.xml><?xml version="1.0" encoding="utf-8"?>
+<ds:datastoreItem xmlns:ds="http://schemas.openxmlformats.org/officeDocument/2006/customXml" ds:itemID="{69A94C35-3303-403A-93B2-0F98A513714C}">
+  <ds:schemaRefs>
+    <ds:schemaRef ds:uri="http://schemas.microsoft.com/sharepoint/v3/contenttype/forms"/>
+  </ds:schemaRefs>
+</ds:datastoreItem>
+</file>
+
+<file path=customXml/itemProps2.xml><?xml version="1.0" encoding="utf-8"?>
 <ds:datastoreItem xmlns:ds="http://schemas.openxmlformats.org/officeDocument/2006/customXml" ds:itemID="{E5A7F73A-7BA0-4FCE-9082-20EA4B3EEC5B}">
   <ds:schemaRefs>
     <ds:schemaRef ds:uri="http://schemas.microsoft.com/office/2006/metadata/contentType"/>
@@ -7606,23 +7291,7 @@
 </ds:datastoreItem>
 </file>
 
-<file path=customXml/itemProps2.xml><?xml version="1.0" encoding="utf-8"?>
-<ds:datastoreItem xmlns:ds="http://schemas.openxmlformats.org/officeDocument/2006/customXml" ds:itemID="{69A94C35-3303-403A-93B2-0F98A513714C}">
-  <ds:schemaRefs>
-    <ds:schemaRef ds:uri="http://schemas.microsoft.com/sharepoint/v3/contenttype/forms"/>
-  </ds:schemaRefs>
-</ds:datastoreItem>
-</file>
-
 <file path=customXml/itemProps3.xml><?xml version="1.0" encoding="utf-8"?>
-<ds:datastoreItem xmlns:ds="http://schemas.openxmlformats.org/officeDocument/2006/customXml" ds:itemID="{7D0AD95B-5C2D-47ED-95C0-987634CE19FD}">
-  <ds:schemaRefs>
-    <ds:schemaRef ds:uri="http://schemas.openxmlformats.org/officeDocument/2006/bibliography"/>
-  </ds:schemaRefs>
-</ds:datastoreItem>
-</file>
-
-<file path=customXml/itemProps4.xml><?xml version="1.0" encoding="utf-8"?>
 <ds:datastoreItem xmlns:ds="http://schemas.openxmlformats.org/officeDocument/2006/customXml" ds:itemID="{C6890507-C7E4-486E-9BF3-EA4FBBA7D31E}">
   <ds:schemaRefs>
     <ds:schemaRef ds:uri="http://schemas.microsoft.com/office/2006/metadata/properties"/>
@@ -7630,4 +7299,12 @@
     <ds:schemaRef ds:uri="39eae624-dce2-4ca1-9525-a899f2494d11"/>
   </ds:schemaRefs>
 </ds:datastoreItem>
+</file>
+
+<file path=customXml/itemProps4.xml><?xml version="1.0" encoding="utf-8"?>
+<ds:datastoreItem xmlns:ds="http://schemas.openxmlformats.org/officeDocument/2006/customXml" ds:itemID="{7D0AD95B-5C2D-47ED-95C0-987634CE19FD}">
+  <ds:schemaRefs>
+    <ds:schemaRef ds:uri="http://schemas.openxmlformats.org/officeDocument/2006/bibliography"/>
+  </ds:schemaRefs>
+</ds:datastoreItem>
 </file>
</xml_diff>